<commit_message>
Add strategic monkey decision procedures
</commit_message>
<xml_diff>
--- a/design/Natural_Selection_Simulation_v4.docx
+++ b/design/Natural_Selection_Simulation_v4.docx
@@ -35,13 +35,19 @@
         <w:t>The simulation intentionally has no food, energy, terrain, or external resource model. Natural selection emerges only from lifespan, strength, reproduction, combat, inherited traits, inherited NN weights, finite space, and local perception.</w:t>
       </w:r>
       <w:r>
-        <w:t xml:space="preserve"> The future intention is to simulate </w:t>
+        <w:t xml:space="preserve"> The intention is to simulate </w:t>
       </w:r>
       <w:r>
         <w:t xml:space="preserve">psychological </w:t>
       </w:r>
       <w:r>
-        <w:t>evolution not biological evolution. Some</w:t>
+        <w:t xml:space="preserve">evolution not biological evolution. </w:t>
+      </w:r>
+      <w:r>
+        <w:t>This is s</w:t>
+      </w:r>
+      <w:r>
+        <w:t>ome</w:t>
       </w:r>
       <w:r>
         <w:t xml:space="preserve"> kind of variation of </w:t>
@@ -208,15 +214,7 @@
         <w:t>.</w:t>
       </w:r>
       <w:r>
-        <w:t xml:space="preserve"> 1 is north (up). 2 is north-east. 3 is east. And </w:t>
-      </w:r>
-      <w:proofErr w:type="gramStart"/>
-      <w:r>
-        <w:t>so</w:t>
-      </w:r>
-      <w:proofErr w:type="gramEnd"/>
-      <w:r>
-        <w:t xml:space="preserve"> on clockwise until 8 is north-west. </w:t>
+        <w:t xml:space="preserve"> 1 is north (up). 2 is north-east. 3 is east. And so on clockwise until 8 is north-west. </w:t>
       </w:r>
     </w:p>
     <w:p>
@@ -246,69 +244,37 @@
         <w:t xml:space="preserve"> (Get vision from world)</w:t>
       </w:r>
       <w:r>
-        <w:t xml:space="preserve"> -</w:t>
-      </w:r>
-      <w:proofErr w:type="gramStart"/>
-      <w:r>
-        <w:t xml:space="preserve">&gt; </w:t>
+        <w:t xml:space="preserve"> -&gt; </w:t>
       </w:r>
       <w:r>
         <w:t xml:space="preserve"> </w:t>
       </w:r>
       <w:r>
-        <w:t>update</w:t>
-      </w:r>
-      <w:proofErr w:type="gramEnd"/>
-      <w:r>
-        <w:t xml:space="preserve"> memory -</w:t>
-      </w:r>
-      <w:proofErr w:type="gramStart"/>
-      <w:r>
-        <w:t xml:space="preserve">&gt; </w:t>
+        <w:t xml:space="preserve">update memory -&gt; </w:t>
       </w:r>
       <w:r>
         <w:t xml:space="preserve"> </w:t>
       </w:r>
       <w:r>
-        <w:t>decide</w:t>
-      </w:r>
-      <w:proofErr w:type="gramEnd"/>
+        <w:t xml:space="preserve">decide </w:t>
+      </w:r>
+      <w:r>
+        <w:t xml:space="preserve">(movement &amp; vision for next turn) </w:t>
+      </w:r>
+      <w:r>
+        <w:t xml:space="preserve">-&gt; </w:t>
+      </w:r>
       <w:r>
         <w:t xml:space="preserve"> </w:t>
       </w:r>
       <w:r>
-        <w:t xml:space="preserve">(movement &amp; vision for next turn) </w:t>
-      </w:r>
-      <w:r>
-        <w:t>-</w:t>
-      </w:r>
-      <w:proofErr w:type="gramStart"/>
-      <w:r>
-        <w:t xml:space="preserve">&gt; </w:t>
+        <w:t xml:space="preserve">request move -&gt; </w:t>
       </w:r>
       <w:r>
         <w:t xml:space="preserve"> </w:t>
       </w:r>
       <w:r>
-        <w:t>request</w:t>
-      </w:r>
-      <w:proofErr w:type="gramEnd"/>
-      <w:r>
-        <w:t xml:space="preserve"> move -</w:t>
-      </w:r>
-      <w:proofErr w:type="gramStart"/>
-      <w:r>
-        <w:t xml:space="preserve">&gt; </w:t>
-      </w:r>
-      <w:r>
-        <w:t xml:space="preserve"> </w:t>
-      </w:r>
-      <w:r>
-        <w:t>board</w:t>
-      </w:r>
-      <w:proofErr w:type="gramEnd"/>
-      <w:r>
-        <w:t xml:space="preserve"> resolves -&gt; age/death/reproduction</w:t>
+        <w:t>board resolves -&gt; age/death/reproduction</w:t>
       </w:r>
     </w:p>
     <w:p>
@@ -595,15 +561,7 @@
           </w:tcPr>
           <w:p>
             <w:r>
-              <w:t xml:space="preserve">GenCount = </w:t>
-            </w:r>
-            <w:proofErr w:type="gramStart"/>
-            <w:r>
-              <w:t>max(</w:t>
-            </w:r>
-            <w:proofErr w:type="gramEnd"/>
-            <w:r>
-              <w:t>mother's GenCount, father's GenCount) + 1</w:t>
+              <w:t>GenCount = max(mother's GenCount, father's GenCount) + 1</w:t>
             </w:r>
           </w:p>
         </w:tc>
@@ -1282,15 +1240,7 @@
         </w:numPr>
       </w:pPr>
       <w:r>
-        <w:t xml:space="preserve">Then use clockwise order as final </w:t>
-      </w:r>
-      <w:proofErr w:type="gramStart"/>
-      <w:r>
-        <w:t>tie-breaker</w:t>
-      </w:r>
-      <w:proofErr w:type="gramEnd"/>
-      <w:r>
-        <w:t>.</w:t>
+        <w:t>Then use clockwise order as final tie-breaker.</w:t>
       </w:r>
     </w:p>
     <w:p>
@@ -1351,15 +1301,7 @@
         </w:numPr>
       </w:pPr>
       <w:r>
-        <w:t>Let baseSide = floor(</w:t>
-      </w:r>
-      <w:proofErr w:type="gramStart"/>
-      <w:r>
-        <w:t>sqrt(</w:t>
-      </w:r>
-      <w:proofErr w:type="gramEnd"/>
-      <w:r>
-        <w:t>Vx)).</w:t>
+        <w:t>Let baseSide = floor(sqrt(Vx)).</w:t>
       </w:r>
     </w:p>
     <w:p>
@@ -1409,15 +1351,7 @@
     <w:p>
       <w:r>
         <w:lastRenderedPageBreak/>
-        <w:t xml:space="preserve">To demonstrate far/near vision. It is defined by c above. The cell with draw of X is where the monkey stands. </w:t>
-      </w:r>
-      <w:proofErr w:type="gramStart"/>
-      <w:r>
-        <w:t>Lets</w:t>
-      </w:r>
-      <w:proofErr w:type="gramEnd"/>
-      <w:r>
-        <w:t xml:space="preserve"> assume vx=9 and vision direction is vertical up.</w:t>
+        <w:t>To demonstrate far/near vision. It is defined by c above. The cell with draw of X is where the monkey stands. Lets assume vx=9 and vision direction is vertical up.</w:t>
       </w:r>
       <w:r>
         <w:br/>
@@ -1746,7 +1680,7 @@
     <w:p/>
     <w:p>
       <w:r>
-        <w:pict w14:anchorId="547CC944">
+        <w:pict w14:anchorId="62B7DF6C">
           <v:rect id="_x0000_i1031" style="width:0;height:1.5pt" o:hralign="center" o:bullet="t" o:hrstd="t" o:hr="t" fillcolor="#a0a0a0" stroked="f"/>
         </w:pict>
       </w:r>
@@ -2004,15 +1938,7 @@
       </w:r>
       <w:r>
         <w:br/>
-        <w:t xml:space="preserve">When in mate state the female holds a pointer to the </w:t>
-      </w:r>
-      <w:proofErr w:type="gramStart"/>
-      <w:r>
-        <w:t>male</w:t>
-      </w:r>
-      <w:proofErr w:type="gramEnd"/>
-      <w:r>
-        <w:t xml:space="preserve"> so the world (the board) knows where that male monkey is </w:t>
+        <w:t xml:space="preserve">When in mate state the female holds a pointer to the male so the world (the board) knows where that male monkey is </w:t>
       </w:r>
     </w:p>
     <w:p>
@@ -2119,15 +2045,7 @@
         </w:numPr>
       </w:pPr>
       <w:r>
-        <w:t xml:space="preserve">Both monkey AIs independently </w:t>
-      </w:r>
-      <w:proofErr w:type="gramStart"/>
-      <w:r>
-        <w:t>decide:</w:t>
-      </w:r>
-      <w:proofErr w:type="gramEnd"/>
-      <w:r>
-        <w:t xml:space="preserve"> </w:t>
+        <w:t xml:space="preserve">Both monkey AIs independently decide: </w:t>
       </w:r>
       <w:r>
         <w:rPr>
@@ -2361,22 +2279,7 @@
       </w:r>
       <w:r>
         <w:br/>
-      </w:r>
-      <w:proofErr w:type="gramStart"/>
-      <w:r>
-        <w:t>P(</w:t>
-      </w:r>
-      <w:proofErr w:type="gramEnd"/>
-      <w:r>
-        <w:t xml:space="preserve">A wins) = 1 / (1 + </w:t>
-      </w:r>
-      <w:proofErr w:type="gramStart"/>
-      <w:r>
-        <w:t>exp(</w:t>
-      </w:r>
-      <w:proofErr w:type="gramEnd"/>
-      <w:r>
-        <w:t>-(StrengthA - StrengthB) / sigma_combat))</w:t>
+        <w:t>P(A wins) = 1 / (1 + exp(-(StrengthA - StrengthB) / sigma_combat))</w:t>
       </w:r>
       <w:r>
         <w:br/>
@@ -2531,23 +2434,7 @@
           <w:b/>
           <w:bCs/>
         </w:rPr>
-        <w:t xml:space="preserve">precomputed and stored </w:t>
-      </w:r>
-      <w:proofErr w:type="gramStart"/>
-      <w:r>
-        <w:rPr>
-          <w:b/>
-          <w:bCs/>
-        </w:rPr>
-        <w:t>at the moment</w:t>
-      </w:r>
-      <w:proofErr w:type="gramEnd"/>
-      <w:r>
-        <w:rPr>
-          <w:b/>
-          <w:bCs/>
-        </w:rPr>
-        <w:t xml:space="preserve"> of mating</w:t>
+        <w:t>precomputed and stored at the moment of mating</w:t>
       </w:r>
       <w:r>
         <w:t>.</w:t>
@@ -2673,13 +2560,8 @@
             <w:hideMark/>
           </w:tcPr>
           <w:p>
-            <w:proofErr w:type="gramStart"/>
-            <w:r>
-              <w:t>avg(</w:t>
-            </w:r>
-            <w:proofErr w:type="gramEnd"/>
-            <w:r>
-              <w:t>mother, father) + σ_mutation</w:t>
+            <w:r>
+              <w:t>avg(mother, father) + σ_mutation</w:t>
             </w:r>
           </w:p>
         </w:tc>
@@ -2711,13 +2593,8 @@
             <w:hideMark/>
           </w:tcPr>
           <w:p>
-            <w:proofErr w:type="gramStart"/>
-            <w:r>
-              <w:t>avg(</w:t>
-            </w:r>
-            <w:proofErr w:type="gramEnd"/>
-            <w:r>
-              <w:t>mother, father) + σ_mutation</w:t>
+            <w:r>
+              <w:t>avg(mother, father) + σ_mutation</w:t>
             </w:r>
           </w:p>
         </w:tc>
@@ -2749,13 +2626,8 @@
             <w:hideMark/>
           </w:tcPr>
           <w:p>
-            <w:proofErr w:type="gramStart"/>
-            <w:r>
-              <w:t>avg(</w:t>
-            </w:r>
-            <w:proofErr w:type="gramEnd"/>
-            <w:r>
-              <w:t>mother, father) + σ_mutation</w:t>
+            <w:r>
+              <w:t>avg(mother, father) + σ_mutation</w:t>
             </w:r>
           </w:p>
         </w:tc>
@@ -2884,15 +2756,7 @@
         <w:t xml:space="preserve"> Trait</w:t>
       </w:r>
       <w:r>
-        <w:t xml:space="preserve"> = </w:t>
-      </w:r>
-      <w:proofErr w:type="gramStart"/>
-      <w:r>
-        <w:t>avg(</w:t>
-      </w:r>
-      <w:proofErr w:type="gramEnd"/>
-      <w:r>
-        <w:t>parent_</w:t>
+        <w:t xml:space="preserve"> = avg(parent_</w:t>
       </w:r>
       <w:r>
         <w:rPr>
@@ -2920,15 +2784,7 @@
         <w:t xml:space="preserve"> Trait</w:t>
       </w:r>
       <w:r>
-        <w:t xml:space="preserve"> = </w:t>
-      </w:r>
-      <w:proofErr w:type="gramStart"/>
-      <w:r>
-        <w:t>clamp(</w:t>
-      </w:r>
-      <w:proofErr w:type="gramEnd"/>
-      <w:r>
-        <w:t>raw_child_</w:t>
+        <w:t xml:space="preserve"> = clamp(raw_child_</w:t>
       </w:r>
       <w:r>
         <w:rPr>
@@ -3386,7 +3242,17 @@
           </w:tcPr>
           <w:p>
             <w:r>
-              <w:t>4 nodes</w:t>
+              <w:t>1</w:t>
+            </w:r>
+            <w:r>
+              <w:rPr>
+                <w:rFonts w:hint="cs"/>
+                <w:rtl/>
+              </w:rPr>
+              <w:t>3</w:t>
+            </w:r>
+            <w:r>
+              <w:t xml:space="preserve"> nodes</w:t>
             </w:r>
           </w:p>
         </w:tc>
@@ -3398,25 +3264,146 @@
           </w:tcPr>
           <w:p>
             <w:r>
-              <w:t>1 movement options (0-9; 0=stay do not move) + 1 mate yes/no</w:t>
-            </w:r>
-          </w:p>
-          <w:p>
-            <w:r>
-              <w:t>+ 1 vision far/near +1 vision direction</w:t>
+              <w:rPr>
+                <w:rFonts w:hint="cs"/>
+                <w:rtl/>
+              </w:rPr>
+              <w:t>3</w:t>
+            </w:r>
+            <w:r>
+              <w:t xml:space="preserve"> </w:t>
+            </w:r>
+            <w:r>
+              <w:t xml:space="preserve">* </w:t>
+            </w:r>
+            <w:r>
+              <w:t xml:space="preserve">strategic </w:t>
+            </w:r>
+            <w:r>
+              <w:br/>
+            </w:r>
+            <w:r>
+              <w:t xml:space="preserve">1 </w:t>
+            </w:r>
+            <w:r>
+              <w:t xml:space="preserve">* </w:t>
+            </w:r>
+            <w:r>
+              <w:t xml:space="preserve">mate yes/no node; </w:t>
+            </w:r>
+            <w:r>
+              <w:br/>
+            </w:r>
+            <w:r>
+              <w:t xml:space="preserve">1 </w:t>
+            </w:r>
+            <w:r>
+              <w:t xml:space="preserve">* </w:t>
+            </w:r>
+            <w:r>
+              <w:t xml:space="preserve">vision far/near node; </w:t>
+            </w:r>
+            <w:r>
+              <w:br/>
+            </w:r>
+            <w:r>
+              <w:t>8</w:t>
+            </w:r>
+            <w:r>
+              <w:t xml:space="preserve"> *</w:t>
+            </w:r>
+            <w:r>
+              <w:t xml:space="preserve"> vision direction nodes: North, NE, East, SE, South, SW, West, NW.</w:t>
+            </w:r>
+            <w:r>
+              <w:t xml:space="preserve"> </w:t>
             </w:r>
           </w:p>
         </w:tc>
       </w:tr>
     </w:tbl>
     <w:p>
-      <w:r>
-        <w:t xml:space="preserve">Movement and vision direction: Round(output) clamped to 0–8 </w:t>
-      </w:r>
-    </w:p>
-    <w:p>
-      <w:r>
-        <w:t>Mate and far/near: output &gt; 0.5 → true</w:t>
+      <w:pPr>
+        <w:pStyle w:val="ListParagraph"/>
+        <w:numPr>
+          <w:ilvl w:val="2"/>
+          <w:numId w:val="11"/>
+        </w:numPr>
+        <w:ind w:left="567" w:hanging="283"/>
+      </w:pPr>
+      <w:r>
+        <w:t>S</w:t>
+      </w:r>
+      <w:r>
+        <w:t>trategic decision</w:t>
+      </w:r>
+      <w:r>
+        <w:t xml:space="preserve">: </w:t>
+      </w:r>
+      <w:r>
+        <w:t>3</w:t>
+      </w:r>
+      <w:r>
+        <w:t xml:space="preserve"> output nodes. The highest value wins: </w:t>
+      </w:r>
+      <w:r>
+        <w:t xml:space="preserve">a. </w:t>
+      </w:r>
+      <w:r>
+        <w:t>Eid</w:t>
+      </w:r>
+      <w:r>
+        <w:t xml:space="preserve"> </w:t>
+      </w:r>
+      <w:r>
+        <w:t>(written here Eid to distinguish from Id)</w:t>
+      </w:r>
+      <w:r>
+        <w:t xml:space="preserve">, </w:t>
+      </w:r>
+      <w:r>
+        <w:t xml:space="preserve">b. </w:t>
+      </w:r>
+      <w:r>
+        <w:t xml:space="preserve">Ago, </w:t>
+      </w:r>
+      <w:r>
+        <w:t xml:space="preserve">c. </w:t>
+      </w:r>
+      <w:r>
+        <w:t xml:space="preserve">Super </w:t>
+      </w:r>
+      <w:r>
+        <w:t>A</w:t>
+      </w:r>
+      <w:r>
+        <w:t>go.</w:t>
+      </w:r>
+    </w:p>
+    <w:p>
+      <w:pPr>
+        <w:pStyle w:val="ListParagraph"/>
+        <w:numPr>
+          <w:ilvl w:val="2"/>
+          <w:numId w:val="11"/>
+        </w:numPr>
+        <w:ind w:left="567" w:hanging="283"/>
+      </w:pPr>
+      <w:r>
+        <w:t>Mate and vision range remain boolean outputs: mate yes/no and far/near use output &gt; 0.5.</w:t>
+      </w:r>
+    </w:p>
+    <w:p>
+      <w:pPr>
+        <w:pStyle w:val="ListParagraph"/>
+        <w:numPr>
+          <w:ilvl w:val="2"/>
+          <w:numId w:val="11"/>
+        </w:numPr>
+        <w:ind w:left="567" w:hanging="283"/>
+      </w:pPr>
+      <w:r>
+        <w:t>Vision direction uses 8 output nodes; the highest value wins: North, NE, East, SE, South, SW, West, or NW.</w:t>
       </w:r>
     </w:p>
     <w:p>
@@ -3456,19 +3443,44 @@
       <w:r>
         <w:t>Make a strategic decision (layer 3→output)</w:t>
       </w:r>
-    </w:p>
-    <w:p>
-      <w:pPr>
-        <w:ind w:left="720"/>
-      </w:pPr>
-      <w:r>
-        <w:t>In future I would like to have 3 basic strategies in hidden layer 3</w:t>
-      </w:r>
-      <w:r>
-        <w:t>. It</w:t>
-      </w:r>
-      <w:r>
-        <w:t xml:space="preserve"> may be 60 nodes, so AI will choose strategy:</w:t>
+      <w:r>
+        <w:rPr>
+          <w:rFonts w:hint="cs"/>
+          <w:rtl/>
+        </w:rPr>
+        <w:t xml:space="preserve"> </w:t>
+      </w:r>
+      <w:proofErr w:type="spellStart"/>
+      <w:r>
+        <w:t>eid</w:t>
+      </w:r>
+      <w:proofErr w:type="spellEnd"/>
+      <w:r>
+        <w:t xml:space="preserve">, </w:t>
+      </w:r>
+      <w:r>
+        <w:t>A</w:t>
+      </w:r>
+      <w:r>
+        <w:t xml:space="preserve">go, or </w:t>
+      </w:r>
+      <w:r>
+        <w:t>S</w:t>
+      </w:r>
+      <w:r>
+        <w:t>uper</w:t>
+      </w:r>
+      <w:r>
+        <w:t>-A</w:t>
+      </w:r>
+      <w:r>
+        <w:t>go</w:t>
+      </w:r>
+      <w:r>
+        <w:t xml:space="preserve"> mod strategy</w:t>
+      </w:r>
+      <w:r>
+        <w:t>:</w:t>
       </w:r>
     </w:p>
     <w:p>
@@ -3480,7 +3492,16 @@
         </w:numPr>
       </w:pPr>
       <w:r>
-        <w:t>Mate, fight or flight mod strategy (like ide)</w:t>
+        <w:t>Eid : fast &amp; short, Kill or Mate</w:t>
+      </w:r>
+      <w:r>
+        <w:t xml:space="preserve"> (like </w:t>
+      </w:r>
+      <w:r>
+        <w:t>Eid</w:t>
+      </w:r>
+      <w:r>
+        <w:t>)</w:t>
       </w:r>
     </w:p>
     <w:p>
@@ -3492,7 +3513,16 @@
         </w:numPr>
       </w:pPr>
       <w:r>
-        <w:t>Do what’s best for me strategy (like ago)</w:t>
+        <w:t>Ago</w:t>
+      </w:r>
+      <w:r>
+        <w:t xml:space="preserve">: Do what’s best for me strategy (like </w:t>
+      </w:r>
+      <w:r>
+        <w:t>A</w:t>
+      </w:r>
+      <w:r>
+        <w:t>go)</w:t>
       </w:r>
     </w:p>
     <w:p>
@@ -3504,7 +3534,46 @@
         </w:numPr>
       </w:pPr>
       <w:r>
-        <w:t>Coalition mode strategy (like super ago)</w:t>
+        <w:lastRenderedPageBreak/>
+        <w:t xml:space="preserve">Super Ago: long vision of </w:t>
+      </w:r>
+      <w:r>
+        <w:t xml:space="preserve">Coalition </w:t>
+      </w:r>
+      <w:r>
+        <w:t>etc’ that will keep my blood line (li</w:t>
+      </w:r>
+      <w:r>
+        <w:t xml:space="preserve">ke </w:t>
+      </w:r>
+      <w:r>
+        <w:t>S</w:t>
+      </w:r>
+      <w:r>
+        <w:t>uper</w:t>
+      </w:r>
+      <w:r>
+        <w:t>-A</w:t>
+      </w:r>
+      <w:r>
+        <w:t>go)</w:t>
+      </w:r>
+    </w:p>
+    <w:p>
+      <w:r>
+        <w:t xml:space="preserve">Note: </w:t>
+      </w:r>
+      <w:r>
+        <w:t xml:space="preserve">See </w:t>
+      </w:r>
+      <w:r>
+        <w:t>section 13 for understanding “</w:t>
+      </w:r>
+      <w:r>
+        <w:t>strategic decision</w:t>
+      </w:r>
+      <w:r>
+        <w:t>”.</w:t>
       </w:r>
     </w:p>
     <w:p/>
@@ -3516,16 +3585,7 @@
         </w:numPr>
       </w:pPr>
       <w:r>
-        <w:lastRenderedPageBreak/>
-        <w:t xml:space="preserve">NN weights of one of the monkeys with the biggest GenCount are stored in a file </w:t>
-      </w:r>
-      <w:proofErr w:type="gramStart"/>
-      <w:r>
-        <w:t>as a result of</w:t>
-      </w:r>
-      <w:proofErr w:type="gramEnd"/>
-      <w:r>
-        <w:t xml:space="preserve"> game training, when a game is closed</w:t>
+        <w:t>NN weights of one of the monkeys with the biggest GenCount are stored in a file as a result of game training, when a game is closed</w:t>
       </w:r>
       <w:r>
         <w:t xml:space="preserve"> or Save button is cli</w:t>
@@ -3614,6 +3674,19 @@
         <w:t>In his turn each monkey receives his vision of the board. Memory is immediately updated from vision results. The NN then reads from memory only, computes its output, and delivers its move to the board.</w:t>
       </w:r>
       <w:r>
+        <w:br/>
+      </w:r>
+    </w:p>
+    <w:p>
+      <w:r>
+        <w:t xml:space="preserve"> </w:t>
+      </w:r>
+    </w:p>
+    <w:p>
+      <w:pPr>
+        <w:ind w:left="720"/>
+      </w:pPr>
+      <w:r>
         <w:pict w14:anchorId="7DBC96EA">
           <v:rect id="_x0000_i1038" style="width:0;height:1.5pt" o:hralign="center" o:hrstd="t" o:hr="t" fillcolor="#a0a0a0" stroked="f"/>
         </w:pict>
@@ -3624,7 +3697,400 @@
         <w:pStyle w:val="Heading4"/>
       </w:pPr>
       <w:r>
-        <w:t>13. Goal</w:t>
+        <w:t xml:space="preserve">13. </w:t>
+      </w:r>
+      <w:r>
+        <w:t xml:space="preserve">Eid, Ago &amp; </w:t>
+      </w:r>
+      <w:proofErr w:type="spellStart"/>
+      <w:r>
+        <w:t>SuperAgo</w:t>
+      </w:r>
+      <w:proofErr w:type="spellEnd"/>
+      <w:r>
+        <w:t xml:space="preserve"> procedures</w:t>
+      </w:r>
+    </w:p>
+    <w:p>
+      <w:r>
+        <w:t>The monkey will have 3 strategic procedures</w:t>
+      </w:r>
+      <w:r>
+        <w:t xml:space="preserve"> </w:t>
+      </w:r>
+      <w:r>
+        <w:t xml:space="preserve">Eid, Ago &amp; </w:t>
+      </w:r>
+      <w:proofErr w:type="spellStart"/>
+      <w:r>
+        <w:t>SuperAgo</w:t>
+      </w:r>
+      <w:proofErr w:type="spellEnd"/>
+      <w:r>
+        <w:t xml:space="preserve">. </w:t>
+      </w:r>
+      <w:r>
+        <w:t xml:space="preserve">Each </w:t>
+      </w:r>
+      <w:r>
+        <w:t xml:space="preserve">procedure </w:t>
+      </w:r>
+      <w:r>
+        <w:t>gets</w:t>
+      </w:r>
+      <w:r>
+        <w:t xml:space="preserve"> the same</w:t>
+      </w:r>
+      <w:r>
+        <w:t xml:space="preserve"> Input of (</w:t>
+      </w:r>
+      <w:r>
+        <w:t>can see</w:t>
+      </w:r>
+      <w:r>
+        <w:t>)</w:t>
+      </w:r>
+      <w:r>
+        <w:t xml:space="preserve"> the monkey’s vision memory</w:t>
+      </w:r>
+      <w:r>
+        <w:t xml:space="preserve">, and </w:t>
+      </w:r>
+      <w:r>
+        <w:t>the</w:t>
+      </w:r>
+      <w:r>
+        <w:t xml:space="preserve"> output (M</w:t>
+      </w:r>
+      <w:r>
+        <w:t xml:space="preserve">ake a </w:t>
+      </w:r>
+      <w:r>
+        <w:t>strategic</w:t>
+      </w:r>
+      <w:r>
+        <w:t xml:space="preserve"> </w:t>
+      </w:r>
+      <w:r>
+        <w:t xml:space="preserve">decision) of where to move to. The output is </w:t>
+      </w:r>
+      <w:r>
+        <w:t xml:space="preserve">one of: </w:t>
+      </w:r>
+      <w:r>
+        <w:t>Stay,</w:t>
+      </w:r>
+      <w:r>
+        <w:t xml:space="preserve"> </w:t>
+      </w:r>
+      <w:r>
+        <w:t>North, NE, East, SE, South, SW, West, or NW.</w:t>
+      </w:r>
+      <w:r>
+        <w:t xml:space="preserve"> </w:t>
+      </w:r>
+    </w:p>
+    <w:p>
+      <w:r>
+        <w:rPr>
+          <w:b/>
+          <w:bCs/>
+        </w:rPr>
+        <w:t xml:space="preserve">If Eid strategic is </w:t>
+      </w:r>
+      <w:r>
+        <w:rPr>
+          <w:b/>
+          <w:bCs/>
+        </w:rPr>
+        <w:t>chosen,</w:t>
+      </w:r>
+      <w:r>
+        <w:t xml:space="preserve"> then:</w:t>
+      </w:r>
+      <w:r>
+        <w:br/>
+        <w:t xml:space="preserve">The monkey will look in his memory for the closest monkey. (if there is a tie, random monkey from the tie). </w:t>
+      </w:r>
+    </w:p>
+    <w:p>
+      <w:pPr>
+        <w:ind w:left="720"/>
+      </w:pPr>
+      <w:r>
+        <w:t xml:space="preserve">If the monkey is of opposite </w:t>
+      </w:r>
+      <w:r>
+        <w:t>sex,</w:t>
+      </w:r>
+      <w:r>
+        <w:t xml:space="preserve"> it will move </w:t>
+      </w:r>
+      <w:r>
+        <w:t>towards</w:t>
+      </w:r>
+      <w:r>
+        <w:t xml:space="preserve"> that monkey and try to mate. If the monkey is of the same sex</w:t>
+      </w:r>
+      <w:r>
+        <w:t xml:space="preserve"> 2 options:</w:t>
+      </w:r>
+    </w:p>
+    <w:p>
+      <w:pPr>
+        <w:pStyle w:val="ListParagraph"/>
+        <w:numPr>
+          <w:ilvl w:val="1"/>
+          <w:numId w:val="17"/>
+        </w:numPr>
+      </w:pPr>
+      <w:r>
+        <w:t>The other monkey is stronger. Then move to the opposite direction (flight).</w:t>
+      </w:r>
+    </w:p>
+    <w:p>
+      <w:pPr>
+        <w:pStyle w:val="ListParagraph"/>
+        <w:numPr>
+          <w:ilvl w:val="1"/>
+          <w:numId w:val="17"/>
+        </w:numPr>
+      </w:pPr>
+      <w:r>
+        <w:t>The other is weaker or equal. Then move towards him for combat (fight).</w:t>
+      </w:r>
+    </w:p>
+    <w:p>
+      <w:r>
+        <w:t>If</w:t>
+      </w:r>
+      <w:r>
+        <w:rPr>
+          <w:lang w:val="en-US"/>
+        </w:rPr>
+        <w:t xml:space="preserve"> next to</w:t>
+      </w:r>
+      <w:r>
+        <w:t xml:space="preserve"> boarder of board a</w:t>
+      </w:r>
+      <w:r>
+        <w:t>nd moving in boarder direction move to opposite direction.</w:t>
+      </w:r>
+      <w:r>
+        <w:br/>
+        <w:t>If no other monkey is in memory keep moving to the same direction of last move.</w:t>
+      </w:r>
+    </w:p>
+    <w:p>
+      <w:r>
+        <w:rPr>
+          <w:b/>
+          <w:bCs/>
+        </w:rPr>
+        <w:t xml:space="preserve">If </w:t>
+      </w:r>
+      <w:r>
+        <w:rPr>
+          <w:b/>
+          <w:bCs/>
+        </w:rPr>
+        <w:t>Ago</w:t>
+      </w:r>
+      <w:r>
+        <w:rPr>
+          <w:b/>
+          <w:bCs/>
+        </w:rPr>
+        <w:t xml:space="preserve"> strategic is chosen,</w:t>
+      </w:r>
+      <w:r>
+        <w:t xml:space="preserve"> then:</w:t>
+      </w:r>
+      <w:r>
+        <w:br/>
+        <w:t>The monkey will look in his memory and find a direction that most of the monkeys are in. (if there is a tie, random direction from the tie). From that direction he will find the closest monkey and do as the Eid will do</w:t>
+      </w:r>
+      <w:r>
+        <w:t>:</w:t>
+      </w:r>
+    </w:p>
+    <w:p>
+      <w:pPr>
+        <w:ind w:left="720"/>
+      </w:pPr>
+      <w:r>
+        <w:lastRenderedPageBreak/>
+        <w:t xml:space="preserve">If the monkey is of opposite sex, it will move </w:t>
+      </w:r>
+      <w:r>
+        <w:t>towards</w:t>
+      </w:r>
+      <w:r>
+        <w:t xml:space="preserve"> that monkey and try to mate. If the monkey is of the same sex 2 options:</w:t>
+      </w:r>
+    </w:p>
+    <w:p>
+      <w:pPr>
+        <w:pStyle w:val="ListParagraph"/>
+        <w:numPr>
+          <w:ilvl w:val="1"/>
+          <w:numId w:val="28"/>
+        </w:numPr>
+      </w:pPr>
+      <w:r>
+        <w:t>The other monkey is stronger. Then move to the opposite direction (flight).</w:t>
+      </w:r>
+    </w:p>
+    <w:p>
+      <w:pPr>
+        <w:pStyle w:val="ListParagraph"/>
+        <w:numPr>
+          <w:ilvl w:val="1"/>
+          <w:numId w:val="28"/>
+        </w:numPr>
+      </w:pPr>
+      <w:r>
+        <w:t>The other is weaker or equal. Then move towards him for combat (fight).</w:t>
+      </w:r>
+    </w:p>
+    <w:p>
+      <w:r>
+        <w:t>If</w:t>
+      </w:r>
+      <w:r>
+        <w:rPr>
+          <w:lang w:val="en-US"/>
+        </w:rPr>
+        <w:t xml:space="preserve"> next to</w:t>
+      </w:r>
+      <w:r>
+        <w:t xml:space="preserve"> boarder of board and moving in boarder direction move to opposite direction.</w:t>
+      </w:r>
+      <w:r>
+        <w:br/>
+        <w:t>If no other monkey is in memory keep moving to the same direction of last move</w:t>
+      </w:r>
+      <w:r>
+        <w:t>.</w:t>
+      </w:r>
+    </w:p>
+    <w:p>
+      <w:r>
+        <w:rPr>
+          <w:b/>
+          <w:bCs/>
+        </w:rPr>
+        <w:t xml:space="preserve">If </w:t>
+      </w:r>
+      <w:r>
+        <w:rPr>
+          <w:b/>
+          <w:bCs/>
+        </w:rPr>
+        <w:t xml:space="preserve">Super </w:t>
+      </w:r>
+      <w:r>
+        <w:rPr>
+          <w:b/>
+          <w:bCs/>
+        </w:rPr>
+        <w:t>Ago</w:t>
+      </w:r>
+      <w:r>
+        <w:rPr>
+          <w:b/>
+          <w:bCs/>
+        </w:rPr>
+        <w:t xml:space="preserve"> strategic is chosen,</w:t>
+      </w:r>
+      <w:r>
+        <w:t xml:space="preserve"> then:</w:t>
+      </w:r>
+      <w:r>
+        <w:br/>
+        <w:t xml:space="preserve">The monkey will look in his memory and find </w:t>
+      </w:r>
+      <w:r>
+        <w:t>the monkeys that are placed in each</w:t>
+      </w:r>
+      <w:r>
+        <w:t xml:space="preserve"> direction</w:t>
+      </w:r>
+      <w:r>
+        <w:t xml:space="preserve">. In each direction he will look at some of strength of all females and all males. If females are stronger that will be a female direction. Else a male direction.  </w:t>
+      </w:r>
+      <w:r>
+        <w:t xml:space="preserve">Now he will treat that direction as if it was a monkey </w:t>
+      </w:r>
+      <w:r>
+        <w:t>and do as the Eid will do</w:t>
+      </w:r>
+      <w:r>
+        <w:t>:</w:t>
+      </w:r>
+    </w:p>
+    <w:p>
+      <w:pPr>
+        <w:ind w:left="720"/>
+      </w:pPr>
+      <w:r>
+        <w:t xml:space="preserve">If the monkey is of opposite sex, it will move </w:t>
+      </w:r>
+      <w:r>
+        <w:t>towards</w:t>
+      </w:r>
+      <w:r>
+        <w:t xml:space="preserve"> that monkey and try to mate. If the monkey is of the same sex 2 options:</w:t>
+      </w:r>
+    </w:p>
+    <w:p>
+      <w:pPr>
+        <w:pStyle w:val="ListParagraph"/>
+        <w:numPr>
+          <w:ilvl w:val="1"/>
+          <w:numId w:val="29"/>
+        </w:numPr>
+      </w:pPr>
+      <w:r>
+        <w:t>The other monkey is stronger. Then move to the opposite direction (flight).</w:t>
+      </w:r>
+    </w:p>
+    <w:p>
+      <w:pPr>
+        <w:pStyle w:val="ListParagraph"/>
+        <w:numPr>
+          <w:ilvl w:val="1"/>
+          <w:numId w:val="29"/>
+        </w:numPr>
+      </w:pPr>
+      <w:r>
+        <w:t>The other is weaker or equal. Then move towards him for combat (fight).</w:t>
+      </w:r>
+    </w:p>
+    <w:p>
+      <w:r>
+        <w:t>If</w:t>
+      </w:r>
+      <w:r>
+        <w:rPr>
+          <w:lang w:val="en-US"/>
+        </w:rPr>
+        <w:t xml:space="preserve"> next to</w:t>
+      </w:r>
+      <w:r>
+        <w:t xml:space="preserve"> boarder of board and moving in boarder direction move to opposite direction.</w:t>
+      </w:r>
+      <w:r>
+        <w:br/>
+        <w:t>If no other monkey is in memory keep moving to the same direction of last move.</w:t>
+      </w:r>
+    </w:p>
+    <w:p>
+      <w:pPr>
+        <w:pStyle w:val="Heading4"/>
+      </w:pPr>
+      <w:r>
+        <w:t>14, Goal</w:t>
       </w:r>
     </w:p>
     <w:p>
@@ -3687,6 +4153,33 @@
       <w:r>
         <w:t xml:space="preserve"> — simulation runs indefinitely.</w:t>
       </w:r>
+      <w:r>
+        <w:t xml:space="preserve"> </w:t>
+      </w:r>
+    </w:p>
+    <w:p>
+      <w:pPr>
+        <w:numPr>
+          <w:ilvl w:val="0"/>
+          <w:numId w:val="13"/>
+        </w:numPr>
+      </w:pPr>
+      <w:r>
+        <w:t xml:space="preserve">When </w:t>
+      </w:r>
+      <w:r>
+        <w:t xml:space="preserve">only 1 monkey is alive. </w:t>
+      </w:r>
+      <w:r>
+        <w:t xml:space="preserve">We start a new “game” but NN weights are not initialized by </w:t>
+      </w:r>
+      <w:r>
+        <w:rPr>
+          <w:b/>
+          <w:bCs/>
+        </w:rPr>
+        <w:t>Xavier</w:t>
+      </w:r>
     </w:p>
     <w:p>
       <w:r>
@@ -3700,7 +4193,13 @@
         <w:pStyle w:val="Heading4"/>
       </w:pPr>
       <w:r>
-        <w:t>14. Resources</w:t>
+        <w:t>1</w:t>
+      </w:r>
+      <w:r>
+        <w:t>5</w:t>
+      </w:r>
+      <w:r>
+        <w:t>. Resources</w:t>
       </w:r>
     </w:p>
     <w:p>
@@ -3741,7 +4240,21 @@
           <w:b/>
           <w:bCs/>
         </w:rPr>
-        <w:t xml:space="preserve">15. Initial Population </w:t>
+        <w:t>1</w:t>
+      </w:r>
+      <w:r>
+        <w:rPr>
+          <w:b/>
+          <w:bCs/>
+        </w:rPr>
+        <w:t>6</w:t>
+      </w:r>
+      <w:r>
+        <w:rPr>
+          <w:b/>
+          <w:bCs/>
+        </w:rPr>
+        <w:t xml:space="preserve">. Initial Population </w:t>
       </w:r>
       <w:r>
         <w:t>(see initial in Configurable parameters)</w:t>
@@ -3928,6 +4441,7 @@
                 <w:b/>
                 <w:bCs/>
               </w:rPr>
+              <w:lastRenderedPageBreak/>
               <w:t>Lifespan</w:t>
             </w:r>
           </w:p>
@@ -4080,7 +4594,6 @@
     </w:tbl>
     <w:p>
       <w:r>
-        <w:lastRenderedPageBreak/>
         <w:pict w14:anchorId="66B00390">
           <v:rect id="_x0000_i1041" style="width:0;height:1.5pt" o:hralign="center" o:hrstd="t" o:hr="t" fillcolor="#a0a0a0" stroked="f"/>
         </w:pict>
@@ -4091,7 +4604,13 @@
         <w:pStyle w:val="Heading4"/>
       </w:pPr>
       <w:r>
-        <w:t>16. Concurrency Model</w:t>
+        <w:t>1</w:t>
+      </w:r>
+      <w:r>
+        <w:t>7</w:t>
+      </w:r>
+      <w:r>
+        <w:t>. Concurrency Model</w:t>
       </w:r>
     </w:p>
     <w:p>
@@ -4310,11 +4829,18 @@
         <w:tblLook w:val="04A0" w:firstRow="1" w:lastRow="0" w:firstColumn="1" w:lastColumn="0" w:noHBand="0" w:noVBand="1"/>
       </w:tblPr>
       <w:tblGrid>
-        <w:gridCol w:w="1766"/>
-        <w:gridCol w:w="3768"/>
+        <w:gridCol w:w="1681"/>
+        <w:gridCol w:w="928"/>
+        <w:gridCol w:w="1716"/>
+        <w:gridCol w:w="3463"/>
+        <w:gridCol w:w="30"/>
+        <w:gridCol w:w="30"/>
+        <w:gridCol w:w="1178"/>
       </w:tblGrid>
       <w:tr>
         <w:trPr>
+          <w:gridAfter w:val="3"/>
+          <w:wAfter w:w="2719" w:type="dxa"/>
           <w:tblHeader/>
           <w:tblCellSpacing w:w="15" w:type="dxa"/>
         </w:trPr>
@@ -4343,6 +4869,7 @@
         <w:tc>
           <w:tcPr>
             <w:tcW w:w="0" w:type="auto"/>
+            <w:gridSpan w:val="3"/>
             <w:vAlign w:val="center"/>
             <w:hideMark/>
           </w:tcPr>
@@ -4365,6 +4892,8 @@
       </w:tr>
       <w:tr>
         <w:trPr>
+          <w:gridAfter w:val="3"/>
+          <w:wAfter w:w="2719" w:type="dxa"/>
           <w:tblCellSpacing w:w="15" w:type="dxa"/>
         </w:trPr>
         <w:tc>
@@ -4382,6 +4911,7 @@
         <w:tc>
           <w:tcPr>
             <w:tcW w:w="0" w:type="auto"/>
+            <w:gridSpan w:val="3"/>
             <w:vAlign w:val="center"/>
             <w:hideMark/>
           </w:tcPr>
@@ -4394,6 +4924,8 @@
       </w:tr>
       <w:tr>
         <w:trPr>
+          <w:gridAfter w:val="3"/>
+          <w:wAfter w:w="2719" w:type="dxa"/>
           <w:tblCellSpacing w:w="15" w:type="dxa"/>
         </w:trPr>
         <w:tc>
@@ -4411,6 +4943,7 @@
         <w:tc>
           <w:tcPr>
             <w:tcW w:w="0" w:type="auto"/>
+            <w:gridSpan w:val="3"/>
             <w:vAlign w:val="center"/>
             <w:hideMark/>
           </w:tcPr>
@@ -4423,6 +4956,8 @@
       </w:tr>
       <w:tr>
         <w:trPr>
+          <w:gridAfter w:val="3"/>
+          <w:wAfter w:w="2719" w:type="dxa"/>
           <w:tblCellSpacing w:w="15" w:type="dxa"/>
         </w:trPr>
         <w:tc>
@@ -4440,6 +4975,7 @@
         <w:tc>
           <w:tcPr>
             <w:tcW w:w="0" w:type="auto"/>
+            <w:gridSpan w:val="3"/>
             <w:vAlign w:val="center"/>
             <w:hideMark/>
           </w:tcPr>
@@ -4452,6 +4988,8 @@
       </w:tr>
       <w:tr>
         <w:trPr>
+          <w:gridAfter w:val="3"/>
+          <w:wAfter w:w="2719" w:type="dxa"/>
           <w:tblCellSpacing w:w="15" w:type="dxa"/>
         </w:trPr>
         <w:tc>
@@ -4462,6 +5000,7 @@
           </w:tcPr>
           <w:p>
             <w:r>
+              <w:lastRenderedPageBreak/>
               <w:t>Pregnant female</w:t>
             </w:r>
           </w:p>
@@ -4469,6 +5008,7 @@
         <w:tc>
           <w:tcPr>
             <w:tcW w:w="0" w:type="auto"/>
+            <w:gridSpan w:val="3"/>
             <w:vAlign w:val="center"/>
             <w:hideMark/>
           </w:tcPr>
@@ -4479,31 +5019,17 @@
           </w:p>
         </w:tc>
       </w:tr>
-    </w:tbl>
-    <w:tbl>
-      <w:tblPr>
-        <w:tblW w:w="0" w:type="auto"/>
-        <w:tblCellSpacing w:w="15" w:type="dxa"/>
-        <w:tblCellMar>
-          <w:top w:w="15" w:type="dxa"/>
-          <w:left w:w="15" w:type="dxa"/>
-          <w:bottom w:w="15" w:type="dxa"/>
-          <w:right w:w="15" w:type="dxa"/>
-        </w:tblCellMar>
-        <w:tblLook w:val="04A0" w:firstRow="1" w:lastRow="0" w:firstColumn="1" w:lastColumn="0" w:noHBand="0" w:noVBand="1"/>
-      </w:tblPr>
-      <w:tblGrid>
-        <w:gridCol w:w="1944"/>
-        <w:gridCol w:w="4813"/>
-      </w:tblGrid>
       <w:tr>
         <w:trPr>
+          <w:gridAfter w:val="2"/>
+          <w:wAfter w:w="1496" w:type="dxa"/>
           <w:tblHeader/>
           <w:tblCellSpacing w:w="15" w:type="dxa"/>
         </w:trPr>
         <w:tc>
           <w:tcPr>
             <w:tcW w:w="0" w:type="auto"/>
+            <w:gridSpan w:val="2"/>
             <w:vAlign w:val="center"/>
             <w:hideMark/>
           </w:tcPr>
@@ -4519,7 +5045,6 @@
                 <w:b/>
                 <w:bCs/>
               </w:rPr>
-              <w:lastRenderedPageBreak/>
               <w:t>Control</w:t>
             </w:r>
           </w:p>
@@ -4527,6 +5052,7 @@
         <w:tc>
           <w:tcPr>
             <w:tcW w:w="0" w:type="auto"/>
+            <w:gridSpan w:val="3"/>
             <w:vAlign w:val="center"/>
             <w:hideMark/>
           </w:tcPr>
@@ -4549,11 +5075,14 @@
       </w:tr>
       <w:tr>
         <w:trPr>
+          <w:gridAfter w:val="2"/>
+          <w:wAfter w:w="1496" w:type="dxa"/>
           <w:tblCellSpacing w:w="15" w:type="dxa"/>
         </w:trPr>
         <w:tc>
           <w:tcPr>
             <w:tcW w:w="0" w:type="auto"/>
+            <w:gridSpan w:val="2"/>
             <w:vAlign w:val="center"/>
             <w:hideMark/>
           </w:tcPr>
@@ -4570,6 +5099,7 @@
         <w:tc>
           <w:tcPr>
             <w:tcW w:w="0" w:type="auto"/>
+            <w:gridSpan w:val="3"/>
             <w:vAlign w:val="center"/>
             <w:hideMark/>
           </w:tcPr>
@@ -4582,11 +5112,14 @@
       </w:tr>
       <w:tr>
         <w:trPr>
+          <w:gridAfter w:val="2"/>
+          <w:wAfter w:w="1496" w:type="dxa"/>
           <w:tblCellSpacing w:w="15" w:type="dxa"/>
         </w:trPr>
         <w:tc>
           <w:tcPr>
             <w:tcW w:w="0" w:type="auto"/>
+            <w:gridSpan w:val="2"/>
             <w:vAlign w:val="center"/>
             <w:hideMark/>
           </w:tcPr>
@@ -4603,6 +5136,7 @@
         <w:tc>
           <w:tcPr>
             <w:tcW w:w="0" w:type="auto"/>
+            <w:gridSpan w:val="3"/>
             <w:vAlign w:val="center"/>
             <w:hideMark/>
           </w:tcPr>
@@ -4615,11 +5149,14 @@
       </w:tr>
       <w:tr>
         <w:trPr>
+          <w:gridAfter w:val="2"/>
+          <w:wAfter w:w="1496" w:type="dxa"/>
           <w:tblCellSpacing w:w="15" w:type="dxa"/>
         </w:trPr>
         <w:tc>
           <w:tcPr>
             <w:tcW w:w="0" w:type="auto"/>
+            <w:gridSpan w:val="2"/>
             <w:vAlign w:val="center"/>
             <w:hideMark/>
           </w:tcPr>
@@ -4636,6 +5173,7 @@
         <w:tc>
           <w:tcPr>
             <w:tcW w:w="0" w:type="auto"/>
+            <w:gridSpan w:val="3"/>
             <w:vAlign w:val="center"/>
             <w:hideMark/>
           </w:tcPr>
@@ -4648,11 +5186,14 @@
       </w:tr>
       <w:tr>
         <w:trPr>
+          <w:gridAfter w:val="2"/>
+          <w:wAfter w:w="1496" w:type="dxa"/>
           <w:tblCellSpacing w:w="15" w:type="dxa"/>
         </w:trPr>
         <w:tc>
           <w:tcPr>
             <w:tcW w:w="0" w:type="auto"/>
+            <w:gridSpan w:val="2"/>
             <w:vAlign w:val="center"/>
             <w:hideMark/>
           </w:tcPr>
@@ -4669,6 +5210,7 @@
         <w:tc>
           <w:tcPr>
             <w:tcW w:w="0" w:type="auto"/>
+            <w:gridSpan w:val="3"/>
             <w:vAlign w:val="center"/>
             <w:hideMark/>
           </w:tcPr>
@@ -4681,11 +5223,14 @@
       </w:tr>
       <w:tr>
         <w:trPr>
+          <w:gridAfter w:val="2"/>
+          <w:wAfter w:w="1496" w:type="dxa"/>
           <w:tblCellSpacing w:w="15" w:type="dxa"/>
         </w:trPr>
         <w:tc>
           <w:tcPr>
             <w:tcW w:w="0" w:type="auto"/>
+            <w:gridSpan w:val="2"/>
             <w:vAlign w:val="center"/>
             <w:hideMark/>
           </w:tcPr>
@@ -4702,6 +5247,7 @@
         <w:tc>
           <w:tcPr>
             <w:tcW w:w="0" w:type="auto"/>
+            <w:gridSpan w:val="3"/>
             <w:vAlign w:val="center"/>
             <w:hideMark/>
           </w:tcPr>
@@ -4712,24 +5258,6 @@
           </w:p>
         </w:tc>
       </w:tr>
-    </w:tbl>
-    <w:tbl>
-      <w:tblPr>
-        <w:tblW w:w="0" w:type="auto"/>
-        <w:tblCellSpacing w:w="15" w:type="dxa"/>
-        <w:tblCellMar>
-          <w:top w:w="15" w:type="dxa"/>
-          <w:left w:w="15" w:type="dxa"/>
-          <w:bottom w:w="15" w:type="dxa"/>
-          <w:right w:w="15" w:type="dxa"/>
-        </w:tblCellMar>
-        <w:tblLook w:val="04A0" w:firstRow="1" w:lastRow="0" w:firstColumn="1" w:lastColumn="0" w:noHBand="0" w:noVBand="1"/>
-      </w:tblPr>
-      <w:tblGrid>
-        <w:gridCol w:w="2001"/>
-        <w:gridCol w:w="5119"/>
-        <w:gridCol w:w="1178"/>
-      </w:tblGrid>
       <w:tr>
         <w:trPr>
           <w:tblHeader/>
@@ -4738,6 +5266,7 @@
         <w:tc>
           <w:tcPr>
             <w:tcW w:w="0" w:type="auto"/>
+            <w:gridSpan w:val="3"/>
             <w:vAlign w:val="center"/>
             <w:hideMark/>
           </w:tcPr>
@@ -4760,6 +5289,7 @@
         <w:tc>
           <w:tcPr>
             <w:tcW w:w="0" w:type="auto"/>
+            <w:gridSpan w:val="3"/>
             <w:vAlign w:val="center"/>
             <w:hideMark/>
           </w:tcPr>
@@ -4807,6 +5337,7 @@
         <w:tc>
           <w:tcPr>
             <w:tcW w:w="0" w:type="auto"/>
+            <w:gridSpan w:val="3"/>
             <w:vAlign w:val="center"/>
             <w:hideMark/>
           </w:tcPr>
@@ -4823,6 +5354,7 @@
         <w:tc>
           <w:tcPr>
             <w:tcW w:w="0" w:type="auto"/>
+            <w:gridSpan w:val="3"/>
             <w:vAlign w:val="center"/>
             <w:hideMark/>
           </w:tcPr>
@@ -4850,6 +5382,7 @@
         <w:tc>
           <w:tcPr>
             <w:tcW w:w="0" w:type="auto"/>
+            <w:gridSpan w:val="3"/>
             <w:vAlign w:val="center"/>
             <w:hideMark/>
           </w:tcPr>
@@ -4866,6 +5399,7 @@
         <w:tc>
           <w:tcPr>
             <w:tcW w:w="0" w:type="auto"/>
+            <w:gridSpan w:val="3"/>
             <w:vAlign w:val="center"/>
             <w:hideMark/>
           </w:tcPr>
@@ -4893,6 +5427,7 @@
         <w:tc>
           <w:tcPr>
             <w:tcW w:w="0" w:type="auto"/>
+            <w:gridSpan w:val="3"/>
             <w:vAlign w:val="center"/>
             <w:hideMark/>
           </w:tcPr>
@@ -4909,6 +5444,7 @@
         <w:tc>
           <w:tcPr>
             <w:tcW w:w="0" w:type="auto"/>
+            <w:gridSpan w:val="3"/>
             <w:vAlign w:val="center"/>
             <w:hideMark/>
           </w:tcPr>
@@ -4936,6 +5472,7 @@
         <w:tc>
           <w:tcPr>
             <w:tcW w:w="0" w:type="auto"/>
+            <w:gridSpan w:val="3"/>
             <w:vAlign w:val="center"/>
             <w:hideMark/>
           </w:tcPr>
@@ -4952,6 +5489,7 @@
         <w:tc>
           <w:tcPr>
             <w:tcW w:w="0" w:type="auto"/>
+            <w:gridSpan w:val="3"/>
             <w:vAlign w:val="center"/>
             <w:hideMark/>
           </w:tcPr>
@@ -4979,6 +5517,7 @@
         <w:tc>
           <w:tcPr>
             <w:tcW w:w="0" w:type="auto"/>
+            <w:gridSpan w:val="3"/>
             <w:vAlign w:val="center"/>
             <w:hideMark/>
           </w:tcPr>
@@ -4995,6 +5534,7 @@
         <w:tc>
           <w:tcPr>
             <w:tcW w:w="0" w:type="auto"/>
+            <w:gridSpan w:val="3"/>
             <w:vAlign w:val="center"/>
             <w:hideMark/>
           </w:tcPr>
@@ -5022,6 +5562,7 @@
         <w:tc>
           <w:tcPr>
             <w:tcW w:w="0" w:type="auto"/>
+            <w:gridSpan w:val="3"/>
             <w:vAlign w:val="center"/>
             <w:hideMark/>
           </w:tcPr>
@@ -5038,6 +5579,7 @@
         <w:tc>
           <w:tcPr>
             <w:tcW w:w="0" w:type="auto"/>
+            <w:gridSpan w:val="3"/>
             <w:vAlign w:val="center"/>
             <w:hideMark/>
           </w:tcPr>
@@ -5065,6 +5607,7 @@
         <w:tc>
           <w:tcPr>
             <w:tcW w:w="0" w:type="auto"/>
+            <w:gridSpan w:val="3"/>
             <w:vAlign w:val="center"/>
           </w:tcPr>
           <w:p>
@@ -5086,6 +5629,7 @@
         <w:tc>
           <w:tcPr>
             <w:tcW w:w="0" w:type="auto"/>
+            <w:gridSpan w:val="3"/>
             <w:vAlign w:val="center"/>
           </w:tcPr>
           <w:p>
@@ -5112,6 +5656,7 @@
         <w:tc>
           <w:tcPr>
             <w:tcW w:w="0" w:type="auto"/>
+            <w:gridSpan w:val="3"/>
             <w:vAlign w:val="center"/>
             <w:hideMark/>
           </w:tcPr>
@@ -5128,6 +5673,7 @@
         <w:tc>
           <w:tcPr>
             <w:tcW w:w="0" w:type="auto"/>
+            <w:gridSpan w:val="3"/>
             <w:vAlign w:val="center"/>
             <w:hideMark/>
           </w:tcPr>
@@ -5155,6 +5701,7 @@
         <w:tc>
           <w:tcPr>
             <w:tcW w:w="0" w:type="auto"/>
+            <w:gridSpan w:val="3"/>
             <w:vAlign w:val="center"/>
             <w:hideMark/>
           </w:tcPr>
@@ -5171,6 +5718,7 @@
         <w:tc>
           <w:tcPr>
             <w:tcW w:w="0" w:type="auto"/>
+            <w:gridSpan w:val="3"/>
             <w:vAlign w:val="center"/>
             <w:hideMark/>
           </w:tcPr>
@@ -5198,6 +5746,7 @@
         <w:tc>
           <w:tcPr>
             <w:tcW w:w="0" w:type="auto"/>
+            <w:gridSpan w:val="3"/>
             <w:vAlign w:val="center"/>
             <w:hideMark/>
           </w:tcPr>
@@ -5214,6 +5763,7 @@
         <w:tc>
           <w:tcPr>
             <w:tcW w:w="0" w:type="auto"/>
+            <w:gridSpan w:val="3"/>
             <w:vAlign w:val="center"/>
             <w:hideMark/>
           </w:tcPr>
@@ -5562,7 +6112,13 @@
         <w:spacing w:before="160" w:after="80"/>
       </w:pPr>
       <w:r>
-        <w:t>17. GUI Layer</w:t>
+        <w:t>1</w:t>
+      </w:r>
+      <w:r>
+        <w:t>8</w:t>
+      </w:r>
+      <w:r>
+        <w:t>. GUI Layer</w:t>
       </w:r>
     </w:p>
     <w:p>
@@ -5710,7 +6266,14 @@
         <w:spacing w:before="160" w:after="80"/>
       </w:pPr>
       <w:r>
-        <w:t>18. Logic Layer and Unit Boundaries</w:t>
+        <w:lastRenderedPageBreak/>
+        <w:t>1</w:t>
+      </w:r>
+      <w:r>
+        <w:t>9</w:t>
+      </w:r>
+      <w:r>
+        <w:t>. Logic Layer and Unit Boundaries</w:t>
       </w:r>
     </w:p>
     <w:p>
@@ -6587,6 +7150,237 @@
     </w:lvl>
   </w:abstractNum>
   <w:abstractNum w:abstractNumId="6" w15:restartNumberingAfterBreak="0">
+    <w:nsid w:val="23036324"/>
+    <w:multiLevelType w:val="hybridMultilevel"/>
+    <w:tmpl w:val="3B023DF2"/>
+    <w:lvl w:ilvl="0" w:tplc="0C00000F">
+      <w:start w:val="1"/>
+      <w:numFmt w:val="decimal"/>
+      <w:lvlText w:val="%1."/>
+      <w:lvlJc w:val="left"/>
+      <w:pPr>
+        <w:ind w:left="720" w:hanging="360"/>
+      </w:pPr>
+    </w:lvl>
+    <w:lvl w:ilvl="1" w:tplc="0C000019" w:tentative="1">
+      <w:start w:val="1"/>
+      <w:numFmt w:val="lowerLetter"/>
+      <w:lvlText w:val="%2."/>
+      <w:lvlJc w:val="left"/>
+      <w:pPr>
+        <w:ind w:left="1440" w:hanging="360"/>
+      </w:pPr>
+    </w:lvl>
+    <w:lvl w:ilvl="2" w:tplc="0C00001B" w:tentative="1">
+      <w:start w:val="1"/>
+      <w:numFmt w:val="lowerRoman"/>
+      <w:lvlText w:val="%3."/>
+      <w:lvlJc w:val="right"/>
+      <w:pPr>
+        <w:ind w:left="2160" w:hanging="180"/>
+      </w:pPr>
+    </w:lvl>
+    <w:lvl w:ilvl="3" w:tplc="0C00000F" w:tentative="1">
+      <w:start w:val="1"/>
+      <w:numFmt w:val="decimal"/>
+      <w:lvlText w:val="%4."/>
+      <w:lvlJc w:val="left"/>
+      <w:pPr>
+        <w:ind w:left="2880" w:hanging="360"/>
+      </w:pPr>
+    </w:lvl>
+    <w:lvl w:ilvl="4" w:tplc="0C000019" w:tentative="1">
+      <w:start w:val="1"/>
+      <w:numFmt w:val="lowerLetter"/>
+      <w:lvlText w:val="%5."/>
+      <w:lvlJc w:val="left"/>
+      <w:pPr>
+        <w:ind w:left="3600" w:hanging="360"/>
+      </w:pPr>
+    </w:lvl>
+    <w:lvl w:ilvl="5" w:tplc="0C00001B" w:tentative="1">
+      <w:start w:val="1"/>
+      <w:numFmt w:val="lowerRoman"/>
+      <w:lvlText w:val="%6."/>
+      <w:lvlJc w:val="right"/>
+      <w:pPr>
+        <w:ind w:left="4320" w:hanging="180"/>
+      </w:pPr>
+    </w:lvl>
+    <w:lvl w:ilvl="6" w:tplc="0C00000F" w:tentative="1">
+      <w:start w:val="1"/>
+      <w:numFmt w:val="decimal"/>
+      <w:lvlText w:val="%7."/>
+      <w:lvlJc w:val="left"/>
+      <w:pPr>
+        <w:ind w:left="5040" w:hanging="360"/>
+      </w:pPr>
+    </w:lvl>
+    <w:lvl w:ilvl="7" w:tplc="0C000019" w:tentative="1">
+      <w:start w:val="1"/>
+      <w:numFmt w:val="lowerLetter"/>
+      <w:lvlText w:val="%8."/>
+      <w:lvlJc w:val="left"/>
+      <w:pPr>
+        <w:ind w:left="5760" w:hanging="360"/>
+      </w:pPr>
+    </w:lvl>
+    <w:lvl w:ilvl="8" w:tplc="0C00001B" w:tentative="1">
+      <w:start w:val="1"/>
+      <w:numFmt w:val="lowerRoman"/>
+      <w:lvlText w:val="%9."/>
+      <w:lvlJc w:val="right"/>
+      <w:pPr>
+        <w:ind w:left="6480" w:hanging="180"/>
+      </w:pPr>
+    </w:lvl>
+  </w:abstractNum>
+  <w:abstractNum w:abstractNumId="7" w15:restartNumberingAfterBreak="0">
+    <w:nsid w:val="29543569"/>
+    <w:multiLevelType w:val="multilevel"/>
+    <w:tmpl w:val="1F1E023A"/>
+    <w:lvl w:ilvl="0">
+      <w:start w:val="1"/>
+      <w:numFmt w:val="bullet"/>
+      <w:lvlText w:val=""/>
+      <w:lvlJc w:val="left"/>
+      <w:pPr>
+        <w:tabs>
+          <w:tab w:val="num" w:pos="720"/>
+        </w:tabs>
+        <w:ind w:left="720" w:hanging="360"/>
+      </w:pPr>
+      <w:rPr>
+        <w:rFonts w:ascii="Symbol" w:hAnsi="Symbol" w:hint="default"/>
+        <w:sz w:val="20"/>
+      </w:rPr>
+    </w:lvl>
+    <w:lvl w:ilvl="1">
+      <w:start w:val="1"/>
+      <w:numFmt w:val="decimal"/>
+      <w:lvlText w:val="%2."/>
+      <w:lvlJc w:val="left"/>
+      <w:pPr>
+        <w:ind w:left="1440" w:hanging="360"/>
+      </w:pPr>
+      <w:rPr>
+        <w:rFonts w:hint="default"/>
+      </w:rPr>
+    </w:lvl>
+    <w:lvl w:ilvl="2" w:tentative="1">
+      <w:start w:val="1"/>
+      <w:numFmt w:val="bullet"/>
+      <w:lvlText w:val=""/>
+      <w:lvlJc w:val="left"/>
+      <w:pPr>
+        <w:tabs>
+          <w:tab w:val="num" w:pos="2160"/>
+        </w:tabs>
+        <w:ind w:left="2160" w:hanging="360"/>
+      </w:pPr>
+      <w:rPr>
+        <w:rFonts w:ascii="Wingdings" w:hAnsi="Wingdings" w:hint="default"/>
+        <w:sz w:val="20"/>
+      </w:rPr>
+    </w:lvl>
+    <w:lvl w:ilvl="3" w:tentative="1">
+      <w:start w:val="1"/>
+      <w:numFmt w:val="bullet"/>
+      <w:lvlText w:val=""/>
+      <w:lvlJc w:val="left"/>
+      <w:pPr>
+        <w:tabs>
+          <w:tab w:val="num" w:pos="2880"/>
+        </w:tabs>
+        <w:ind w:left="2880" w:hanging="360"/>
+      </w:pPr>
+      <w:rPr>
+        <w:rFonts w:ascii="Wingdings" w:hAnsi="Wingdings" w:hint="default"/>
+        <w:sz w:val="20"/>
+      </w:rPr>
+    </w:lvl>
+    <w:lvl w:ilvl="4" w:tentative="1">
+      <w:start w:val="1"/>
+      <w:numFmt w:val="bullet"/>
+      <w:lvlText w:val=""/>
+      <w:lvlJc w:val="left"/>
+      <w:pPr>
+        <w:tabs>
+          <w:tab w:val="num" w:pos="3600"/>
+        </w:tabs>
+        <w:ind w:left="3600" w:hanging="360"/>
+      </w:pPr>
+      <w:rPr>
+        <w:rFonts w:ascii="Wingdings" w:hAnsi="Wingdings" w:hint="default"/>
+        <w:sz w:val="20"/>
+      </w:rPr>
+    </w:lvl>
+    <w:lvl w:ilvl="5" w:tentative="1">
+      <w:start w:val="1"/>
+      <w:numFmt w:val="bullet"/>
+      <w:lvlText w:val=""/>
+      <w:lvlJc w:val="left"/>
+      <w:pPr>
+        <w:tabs>
+          <w:tab w:val="num" w:pos="4320"/>
+        </w:tabs>
+        <w:ind w:left="4320" w:hanging="360"/>
+      </w:pPr>
+      <w:rPr>
+        <w:rFonts w:ascii="Wingdings" w:hAnsi="Wingdings" w:hint="default"/>
+        <w:sz w:val="20"/>
+      </w:rPr>
+    </w:lvl>
+    <w:lvl w:ilvl="6" w:tentative="1">
+      <w:start w:val="1"/>
+      <w:numFmt w:val="bullet"/>
+      <w:lvlText w:val=""/>
+      <w:lvlJc w:val="left"/>
+      <w:pPr>
+        <w:tabs>
+          <w:tab w:val="num" w:pos="5040"/>
+        </w:tabs>
+        <w:ind w:left="5040" w:hanging="360"/>
+      </w:pPr>
+      <w:rPr>
+        <w:rFonts w:ascii="Wingdings" w:hAnsi="Wingdings" w:hint="default"/>
+        <w:sz w:val="20"/>
+      </w:rPr>
+    </w:lvl>
+    <w:lvl w:ilvl="7" w:tentative="1">
+      <w:start w:val="1"/>
+      <w:numFmt w:val="bullet"/>
+      <w:lvlText w:val=""/>
+      <w:lvlJc w:val="left"/>
+      <w:pPr>
+        <w:tabs>
+          <w:tab w:val="num" w:pos="5760"/>
+        </w:tabs>
+        <w:ind w:left="5760" w:hanging="360"/>
+      </w:pPr>
+      <w:rPr>
+        <w:rFonts w:ascii="Wingdings" w:hAnsi="Wingdings" w:hint="default"/>
+        <w:sz w:val="20"/>
+      </w:rPr>
+    </w:lvl>
+    <w:lvl w:ilvl="8" w:tentative="1">
+      <w:start w:val="1"/>
+      <w:numFmt w:val="bullet"/>
+      <w:lvlText w:val=""/>
+      <w:lvlJc w:val="left"/>
+      <w:pPr>
+        <w:tabs>
+          <w:tab w:val="num" w:pos="6480"/>
+        </w:tabs>
+        <w:ind w:left="6480" w:hanging="360"/>
+      </w:pPr>
+      <w:rPr>
+        <w:rFonts w:ascii="Wingdings" w:hAnsi="Wingdings" w:hint="default"/>
+        <w:sz w:val="20"/>
+      </w:rPr>
+    </w:lvl>
+  </w:abstractNum>
+  <w:abstractNum w:abstractNumId="8" w15:restartNumberingAfterBreak="0">
     <w:nsid w:val="2C9C1E7C"/>
     <w:multiLevelType w:val="multilevel"/>
     <w:tmpl w:val="622A492C"/>
@@ -6735,10 +7529,10 @@
       </w:rPr>
     </w:lvl>
   </w:abstractNum>
-  <w:abstractNum w:abstractNumId="7" w15:restartNumberingAfterBreak="0">
+  <w:abstractNum w:abstractNumId="9" w15:restartNumberingAfterBreak="0">
     <w:nsid w:val="2EC73B95"/>
     <w:multiLevelType w:val="multilevel"/>
-    <w:tmpl w:val="E3BAFA16"/>
+    <w:tmpl w:val="680C30A6"/>
     <w:lvl w:ilvl="0">
       <w:start w:val="1"/>
       <w:numFmt w:val="bullet"/>
@@ -6755,36 +7549,28 @@
         <w:sz w:val="20"/>
       </w:rPr>
     </w:lvl>
-    <w:lvl w:ilvl="1" w:tentative="1">
-      <w:start w:val="1"/>
-      <w:numFmt w:val="bullet"/>
-      <w:lvlText w:val="o"/>
-      <w:lvlJc w:val="left"/>
-      <w:pPr>
-        <w:tabs>
-          <w:tab w:val="num" w:pos="1440"/>
-        </w:tabs>
+    <w:lvl w:ilvl="1">
+      <w:start w:val="1"/>
+      <w:numFmt w:val="upperLetter"/>
+      <w:lvlText w:val="%2."/>
+      <w:lvlJc w:val="left"/>
+      <w:pPr>
         <w:ind w:left="1440" w:hanging="360"/>
       </w:pPr>
       <w:rPr>
-        <w:rFonts w:ascii="Courier New" w:hAnsi="Courier New" w:hint="default"/>
-        <w:sz w:val="20"/>
-      </w:rPr>
-    </w:lvl>
-    <w:lvl w:ilvl="2" w:tentative="1">
-      <w:start w:val="1"/>
-      <w:numFmt w:val="bullet"/>
-      <w:lvlText w:val=""/>
-      <w:lvlJc w:val="left"/>
-      <w:pPr>
-        <w:tabs>
-          <w:tab w:val="num" w:pos="2160"/>
-        </w:tabs>
-        <w:ind w:left="2160" w:hanging="360"/>
-      </w:pPr>
-      <w:rPr>
-        <w:rFonts w:ascii="Wingdings" w:hAnsi="Wingdings" w:hint="default"/>
-        <w:sz w:val="20"/>
+        <w:rFonts w:hint="default"/>
+      </w:rPr>
+    </w:lvl>
+    <w:lvl w:ilvl="2">
+      <w:start w:val="1"/>
+      <w:numFmt w:val="lowerRoman"/>
+      <w:lvlText w:val="%3."/>
+      <w:lvlJc w:val="left"/>
+      <w:pPr>
+        <w:ind w:left="2520" w:hanging="720"/>
+      </w:pPr>
+      <w:rPr>
+        <w:rFonts w:hint="default"/>
       </w:rPr>
     </w:lvl>
     <w:lvl w:ilvl="3" w:tentative="1">
@@ -6884,7 +7670,7 @@
       </w:rPr>
     </w:lvl>
   </w:abstractNum>
-  <w:abstractNum w:abstractNumId="8" w15:restartNumberingAfterBreak="0">
+  <w:abstractNum w:abstractNumId="10" w15:restartNumberingAfterBreak="0">
     <w:nsid w:val="2FD83623"/>
     <w:multiLevelType w:val="multilevel"/>
     <w:tmpl w:val="384C3C44"/>
@@ -7033,7 +7819,7 @@
       </w:rPr>
     </w:lvl>
   </w:abstractNum>
-  <w:abstractNum w:abstractNumId="9" w15:restartNumberingAfterBreak="0">
+  <w:abstractNum w:abstractNumId="11" w15:restartNumberingAfterBreak="0">
     <w:nsid w:val="3C414059"/>
     <w:multiLevelType w:val="multilevel"/>
     <w:tmpl w:val="9D484FA8"/>
@@ -7182,7 +7968,7 @@
       </w:rPr>
     </w:lvl>
   </w:abstractNum>
-  <w:abstractNum w:abstractNumId="10" w15:restartNumberingAfterBreak="0">
+  <w:abstractNum w:abstractNumId="12" w15:restartNumberingAfterBreak="0">
     <w:nsid w:val="42FD3086"/>
     <w:multiLevelType w:val="multilevel"/>
     <w:tmpl w:val="A08C8A84"/>
@@ -7331,7 +8117,7 @@
       </w:rPr>
     </w:lvl>
   </w:abstractNum>
-  <w:abstractNum w:abstractNumId="11" w15:restartNumberingAfterBreak="0">
+  <w:abstractNum w:abstractNumId="13" w15:restartNumberingAfterBreak="0">
     <w:nsid w:val="44F23255"/>
     <w:multiLevelType w:val="multilevel"/>
     <w:tmpl w:val="4C8CE898"/>
@@ -7480,7 +8266,7 @@
       </w:rPr>
     </w:lvl>
   </w:abstractNum>
-  <w:abstractNum w:abstractNumId="12" w15:restartNumberingAfterBreak="0">
+  <w:abstractNum w:abstractNumId="14" w15:restartNumberingAfterBreak="0">
     <w:nsid w:val="492022F2"/>
     <w:multiLevelType w:val="multilevel"/>
     <w:tmpl w:val="BAF6E79C"/>
@@ -7629,7 +8415,7 @@
       </w:rPr>
     </w:lvl>
   </w:abstractNum>
-  <w:abstractNum w:abstractNumId="13" w15:restartNumberingAfterBreak="0">
+  <w:abstractNum w:abstractNumId="15" w15:restartNumberingAfterBreak="0">
     <w:nsid w:val="49882DA7"/>
     <w:multiLevelType w:val="multilevel"/>
     <w:tmpl w:val="454CDCFA"/>
@@ -7778,7 +8564,7 @@
       </w:rPr>
     </w:lvl>
   </w:abstractNum>
-  <w:abstractNum w:abstractNumId="14" w15:restartNumberingAfterBreak="0">
+  <w:abstractNum w:abstractNumId="16" w15:restartNumberingAfterBreak="0">
     <w:nsid w:val="53454814"/>
     <w:multiLevelType w:val="multilevel"/>
     <w:tmpl w:val="BB6CCE46"/>
@@ -7927,7 +8713,7 @@
       </w:rPr>
     </w:lvl>
   </w:abstractNum>
-  <w:abstractNum w:abstractNumId="15" w15:restartNumberingAfterBreak="0">
+  <w:abstractNum w:abstractNumId="17" w15:restartNumberingAfterBreak="0">
     <w:nsid w:val="53940E70"/>
     <w:multiLevelType w:val="hybridMultilevel"/>
     <w:tmpl w:val="091827D4"/>
@@ -8013,7 +8799,7 @@
       </w:pPr>
     </w:lvl>
   </w:abstractNum>
-  <w:abstractNum w:abstractNumId="16" w15:restartNumberingAfterBreak="0">
+  <w:abstractNum w:abstractNumId="18" w15:restartNumberingAfterBreak="0">
     <w:nsid w:val="5C8655CD"/>
     <w:multiLevelType w:val="multilevel"/>
     <w:tmpl w:val="BA7CD0F0"/>
@@ -8126,7 +8912,7 @@
       </w:pPr>
     </w:lvl>
   </w:abstractNum>
-  <w:abstractNum w:abstractNumId="17" w15:restartNumberingAfterBreak="0">
+  <w:abstractNum w:abstractNumId="19" w15:restartNumberingAfterBreak="0">
     <w:nsid w:val="63CA1557"/>
     <w:multiLevelType w:val="hybridMultilevel"/>
     <w:tmpl w:val="D2408FA8"/>
@@ -8239,7 +9025,7 @@
       </w:rPr>
     </w:lvl>
   </w:abstractNum>
-  <w:abstractNum w:abstractNumId="18" w15:restartNumberingAfterBreak="0">
+  <w:abstractNum w:abstractNumId="20" w15:restartNumberingAfterBreak="0">
     <w:nsid w:val="647643F9"/>
     <w:multiLevelType w:val="hybridMultilevel"/>
     <w:tmpl w:val="D17AAE44"/>
@@ -8325,10 +9111,10 @@
       </w:pPr>
     </w:lvl>
   </w:abstractNum>
-  <w:abstractNum w:abstractNumId="19" w15:restartNumberingAfterBreak="0">
+  <w:abstractNum w:abstractNumId="21" w15:restartNumberingAfterBreak="0">
     <w:nsid w:val="650C4461"/>
     <w:multiLevelType w:val="multilevel"/>
-    <w:tmpl w:val="FD60DE90"/>
+    <w:tmpl w:val="1F1E023A"/>
     <w:lvl w:ilvl="0">
       <w:start w:val="1"/>
       <w:numFmt w:val="bullet"/>
@@ -8345,20 +9131,16 @@
         <w:sz w:val="20"/>
       </w:rPr>
     </w:lvl>
-    <w:lvl w:ilvl="1" w:tentative="1">
-      <w:start w:val="1"/>
-      <w:numFmt w:val="bullet"/>
-      <w:lvlText w:val="o"/>
-      <w:lvlJc w:val="left"/>
-      <w:pPr>
-        <w:tabs>
-          <w:tab w:val="num" w:pos="1440"/>
-        </w:tabs>
+    <w:lvl w:ilvl="1">
+      <w:start w:val="1"/>
+      <w:numFmt w:val="decimal"/>
+      <w:lvlText w:val="%2."/>
+      <w:lvlJc w:val="left"/>
+      <w:pPr>
         <w:ind w:left="1440" w:hanging="360"/>
       </w:pPr>
       <w:rPr>
-        <w:rFonts w:ascii="Courier New" w:hAnsi="Courier New" w:hint="default"/>
-        <w:sz w:val="20"/>
+        <w:rFonts w:hint="default"/>
       </w:rPr>
     </w:lvl>
     <w:lvl w:ilvl="2" w:tentative="1">
@@ -8474,7 +9256,152 @@
       </w:rPr>
     </w:lvl>
   </w:abstractNum>
-  <w:abstractNum w:abstractNumId="20" w15:restartNumberingAfterBreak="0">
+  <w:abstractNum w:abstractNumId="22" w15:restartNumberingAfterBreak="0">
+    <w:nsid w:val="65925DB5"/>
+    <w:multiLevelType w:val="multilevel"/>
+    <w:tmpl w:val="1F1E023A"/>
+    <w:lvl w:ilvl="0">
+      <w:start w:val="1"/>
+      <w:numFmt w:val="bullet"/>
+      <w:lvlText w:val=""/>
+      <w:lvlJc w:val="left"/>
+      <w:pPr>
+        <w:tabs>
+          <w:tab w:val="num" w:pos="720"/>
+        </w:tabs>
+        <w:ind w:left="720" w:hanging="360"/>
+      </w:pPr>
+      <w:rPr>
+        <w:rFonts w:ascii="Symbol" w:hAnsi="Symbol" w:hint="default"/>
+        <w:sz w:val="20"/>
+      </w:rPr>
+    </w:lvl>
+    <w:lvl w:ilvl="1">
+      <w:start w:val="1"/>
+      <w:numFmt w:val="decimal"/>
+      <w:lvlText w:val="%2."/>
+      <w:lvlJc w:val="left"/>
+      <w:pPr>
+        <w:ind w:left="1440" w:hanging="360"/>
+      </w:pPr>
+      <w:rPr>
+        <w:rFonts w:hint="default"/>
+      </w:rPr>
+    </w:lvl>
+    <w:lvl w:ilvl="2" w:tentative="1">
+      <w:start w:val="1"/>
+      <w:numFmt w:val="bullet"/>
+      <w:lvlText w:val=""/>
+      <w:lvlJc w:val="left"/>
+      <w:pPr>
+        <w:tabs>
+          <w:tab w:val="num" w:pos="2160"/>
+        </w:tabs>
+        <w:ind w:left="2160" w:hanging="360"/>
+      </w:pPr>
+      <w:rPr>
+        <w:rFonts w:ascii="Wingdings" w:hAnsi="Wingdings" w:hint="default"/>
+        <w:sz w:val="20"/>
+      </w:rPr>
+    </w:lvl>
+    <w:lvl w:ilvl="3" w:tentative="1">
+      <w:start w:val="1"/>
+      <w:numFmt w:val="bullet"/>
+      <w:lvlText w:val=""/>
+      <w:lvlJc w:val="left"/>
+      <w:pPr>
+        <w:tabs>
+          <w:tab w:val="num" w:pos="2880"/>
+        </w:tabs>
+        <w:ind w:left="2880" w:hanging="360"/>
+      </w:pPr>
+      <w:rPr>
+        <w:rFonts w:ascii="Wingdings" w:hAnsi="Wingdings" w:hint="default"/>
+        <w:sz w:val="20"/>
+      </w:rPr>
+    </w:lvl>
+    <w:lvl w:ilvl="4" w:tentative="1">
+      <w:start w:val="1"/>
+      <w:numFmt w:val="bullet"/>
+      <w:lvlText w:val=""/>
+      <w:lvlJc w:val="left"/>
+      <w:pPr>
+        <w:tabs>
+          <w:tab w:val="num" w:pos="3600"/>
+        </w:tabs>
+        <w:ind w:left="3600" w:hanging="360"/>
+      </w:pPr>
+      <w:rPr>
+        <w:rFonts w:ascii="Wingdings" w:hAnsi="Wingdings" w:hint="default"/>
+        <w:sz w:val="20"/>
+      </w:rPr>
+    </w:lvl>
+    <w:lvl w:ilvl="5" w:tentative="1">
+      <w:start w:val="1"/>
+      <w:numFmt w:val="bullet"/>
+      <w:lvlText w:val=""/>
+      <w:lvlJc w:val="left"/>
+      <w:pPr>
+        <w:tabs>
+          <w:tab w:val="num" w:pos="4320"/>
+        </w:tabs>
+        <w:ind w:left="4320" w:hanging="360"/>
+      </w:pPr>
+      <w:rPr>
+        <w:rFonts w:ascii="Wingdings" w:hAnsi="Wingdings" w:hint="default"/>
+        <w:sz w:val="20"/>
+      </w:rPr>
+    </w:lvl>
+    <w:lvl w:ilvl="6" w:tentative="1">
+      <w:start w:val="1"/>
+      <w:numFmt w:val="bullet"/>
+      <w:lvlText w:val=""/>
+      <w:lvlJc w:val="left"/>
+      <w:pPr>
+        <w:tabs>
+          <w:tab w:val="num" w:pos="5040"/>
+        </w:tabs>
+        <w:ind w:left="5040" w:hanging="360"/>
+      </w:pPr>
+      <w:rPr>
+        <w:rFonts w:ascii="Wingdings" w:hAnsi="Wingdings" w:hint="default"/>
+        <w:sz w:val="20"/>
+      </w:rPr>
+    </w:lvl>
+    <w:lvl w:ilvl="7" w:tentative="1">
+      <w:start w:val="1"/>
+      <w:numFmt w:val="bullet"/>
+      <w:lvlText w:val=""/>
+      <w:lvlJc w:val="left"/>
+      <w:pPr>
+        <w:tabs>
+          <w:tab w:val="num" w:pos="5760"/>
+        </w:tabs>
+        <w:ind w:left="5760" w:hanging="360"/>
+      </w:pPr>
+      <w:rPr>
+        <w:rFonts w:ascii="Wingdings" w:hAnsi="Wingdings" w:hint="default"/>
+        <w:sz w:val="20"/>
+      </w:rPr>
+    </w:lvl>
+    <w:lvl w:ilvl="8" w:tentative="1">
+      <w:start w:val="1"/>
+      <w:numFmt w:val="bullet"/>
+      <w:lvlText w:val=""/>
+      <w:lvlJc w:val="left"/>
+      <w:pPr>
+        <w:tabs>
+          <w:tab w:val="num" w:pos="6480"/>
+        </w:tabs>
+        <w:ind w:left="6480" w:hanging="360"/>
+      </w:pPr>
+      <w:rPr>
+        <w:rFonts w:ascii="Wingdings" w:hAnsi="Wingdings" w:hint="default"/>
+        <w:sz w:val="20"/>
+      </w:rPr>
+    </w:lvl>
+  </w:abstractNum>
+  <w:abstractNum w:abstractNumId="23" w15:restartNumberingAfterBreak="0">
     <w:nsid w:val="6717330B"/>
     <w:multiLevelType w:val="multilevel"/>
     <w:tmpl w:val="B70CBC6E"/>
@@ -8623,7 +9550,7 @@
       </w:rPr>
     </w:lvl>
   </w:abstractNum>
-  <w:abstractNum w:abstractNumId="21" w15:restartNumberingAfterBreak="0">
+  <w:abstractNum w:abstractNumId="24" w15:restartNumberingAfterBreak="0">
     <w:nsid w:val="6FAD1D8B"/>
     <w:multiLevelType w:val="hybridMultilevel"/>
     <w:tmpl w:val="198A3DBE"/>
@@ -8709,7 +9636,7 @@
       </w:pPr>
     </w:lvl>
   </w:abstractNum>
-  <w:abstractNum w:abstractNumId="22" w15:restartNumberingAfterBreak="0">
+  <w:abstractNum w:abstractNumId="25" w15:restartNumberingAfterBreak="0">
     <w:nsid w:val="719B2556"/>
     <w:multiLevelType w:val="multilevel"/>
     <w:tmpl w:val="2DB871EC"/>
@@ -8858,7 +9785,7 @@
       </w:rPr>
     </w:lvl>
   </w:abstractNum>
-  <w:abstractNum w:abstractNumId="23" w15:restartNumberingAfterBreak="0">
+  <w:abstractNum w:abstractNumId="26" w15:restartNumberingAfterBreak="0">
     <w:nsid w:val="773C10BD"/>
     <w:multiLevelType w:val="multilevel"/>
     <w:tmpl w:val="C10454B8"/>
@@ -9007,7 +9934,93 @@
       </w:rPr>
     </w:lvl>
   </w:abstractNum>
-  <w:abstractNum w:abstractNumId="24" w15:restartNumberingAfterBreak="0">
+  <w:abstractNum w:abstractNumId="27" w15:restartNumberingAfterBreak="0">
+    <w:nsid w:val="79B90105"/>
+    <w:multiLevelType w:val="hybridMultilevel"/>
+    <w:tmpl w:val="A47E094E"/>
+    <w:lvl w:ilvl="0" w:tplc="0C00000F">
+      <w:start w:val="1"/>
+      <w:numFmt w:val="decimal"/>
+      <w:lvlText w:val="%1."/>
+      <w:lvlJc w:val="left"/>
+      <w:pPr>
+        <w:ind w:left="720" w:hanging="360"/>
+      </w:pPr>
+    </w:lvl>
+    <w:lvl w:ilvl="1" w:tplc="0C000019" w:tentative="1">
+      <w:start w:val="1"/>
+      <w:numFmt w:val="lowerLetter"/>
+      <w:lvlText w:val="%2."/>
+      <w:lvlJc w:val="left"/>
+      <w:pPr>
+        <w:ind w:left="1440" w:hanging="360"/>
+      </w:pPr>
+    </w:lvl>
+    <w:lvl w:ilvl="2" w:tplc="0C00001B" w:tentative="1">
+      <w:start w:val="1"/>
+      <w:numFmt w:val="lowerRoman"/>
+      <w:lvlText w:val="%3."/>
+      <w:lvlJc w:val="right"/>
+      <w:pPr>
+        <w:ind w:left="2160" w:hanging="180"/>
+      </w:pPr>
+    </w:lvl>
+    <w:lvl w:ilvl="3" w:tplc="0C00000F" w:tentative="1">
+      <w:start w:val="1"/>
+      <w:numFmt w:val="decimal"/>
+      <w:lvlText w:val="%4."/>
+      <w:lvlJc w:val="left"/>
+      <w:pPr>
+        <w:ind w:left="2880" w:hanging="360"/>
+      </w:pPr>
+    </w:lvl>
+    <w:lvl w:ilvl="4" w:tplc="0C000019" w:tentative="1">
+      <w:start w:val="1"/>
+      <w:numFmt w:val="lowerLetter"/>
+      <w:lvlText w:val="%5."/>
+      <w:lvlJc w:val="left"/>
+      <w:pPr>
+        <w:ind w:left="3600" w:hanging="360"/>
+      </w:pPr>
+    </w:lvl>
+    <w:lvl w:ilvl="5" w:tplc="0C00001B" w:tentative="1">
+      <w:start w:val="1"/>
+      <w:numFmt w:val="lowerRoman"/>
+      <w:lvlText w:val="%6."/>
+      <w:lvlJc w:val="right"/>
+      <w:pPr>
+        <w:ind w:left="4320" w:hanging="180"/>
+      </w:pPr>
+    </w:lvl>
+    <w:lvl w:ilvl="6" w:tplc="0C00000F" w:tentative="1">
+      <w:start w:val="1"/>
+      <w:numFmt w:val="decimal"/>
+      <w:lvlText w:val="%7."/>
+      <w:lvlJc w:val="left"/>
+      <w:pPr>
+        <w:ind w:left="5040" w:hanging="360"/>
+      </w:pPr>
+    </w:lvl>
+    <w:lvl w:ilvl="7" w:tplc="0C000019" w:tentative="1">
+      <w:start w:val="1"/>
+      <w:numFmt w:val="lowerLetter"/>
+      <w:lvlText w:val="%8."/>
+      <w:lvlJc w:val="left"/>
+      <w:pPr>
+        <w:ind w:left="5760" w:hanging="360"/>
+      </w:pPr>
+    </w:lvl>
+    <w:lvl w:ilvl="8" w:tplc="0C00001B" w:tentative="1">
+      <w:start w:val="1"/>
+      <w:numFmt w:val="lowerRoman"/>
+      <w:lvlText w:val="%9."/>
+      <w:lvlJc w:val="right"/>
+      <w:pPr>
+        <w:ind w:left="6480" w:hanging="180"/>
+      </w:pPr>
+    </w:lvl>
+  </w:abstractNum>
+  <w:abstractNum w:abstractNumId="28" w15:restartNumberingAfterBreak="0">
     <w:nsid w:val="7D3E7928"/>
     <w:multiLevelType w:val="multilevel"/>
     <w:tmpl w:val="9B361032"/>
@@ -9157,13 +10170,13 @@
     </w:lvl>
   </w:abstractNum>
   <w:num w:numId="1" w16cid:durableId="250479743">
-    <w:abstractNumId w:val="13"/>
+    <w:abstractNumId w:val="15"/>
   </w:num>
   <w:num w:numId="2" w16cid:durableId="1636448297">
     <w:abstractNumId w:val="4"/>
   </w:num>
   <w:num w:numId="3" w16cid:durableId="751119469">
-    <w:abstractNumId w:val="10"/>
+    <w:abstractNumId w:val="12"/>
   </w:num>
   <w:num w:numId="4" w16cid:durableId="2007436599">
     <w:abstractNumId w:val="3"/>
@@ -9172,64 +10185,76 @@
     <w:abstractNumId w:val="2"/>
   </w:num>
   <w:num w:numId="6" w16cid:durableId="1355493191">
+    <w:abstractNumId w:val="26"/>
+  </w:num>
+  <w:num w:numId="7" w16cid:durableId="2125995941">
+    <w:abstractNumId w:val="25"/>
+  </w:num>
+  <w:num w:numId="8" w16cid:durableId="1598783071">
+    <w:abstractNumId w:val="13"/>
+  </w:num>
+  <w:num w:numId="9" w16cid:durableId="1825926394">
+    <w:abstractNumId w:val="14"/>
+  </w:num>
+  <w:num w:numId="10" w16cid:durableId="1521700032">
+    <w:abstractNumId w:val="8"/>
+  </w:num>
+  <w:num w:numId="11" w16cid:durableId="1339969525">
+    <w:abstractNumId w:val="9"/>
+  </w:num>
+  <w:num w:numId="12" w16cid:durableId="534124069">
+    <w:abstractNumId w:val="28"/>
+  </w:num>
+  <w:num w:numId="13" w16cid:durableId="635647341">
+    <w:abstractNumId w:val="11"/>
+  </w:num>
+  <w:num w:numId="14" w16cid:durableId="632834326">
     <w:abstractNumId w:val="23"/>
   </w:num>
-  <w:num w:numId="7" w16cid:durableId="2125995941">
-    <w:abstractNumId w:val="22"/>
-  </w:num>
-  <w:num w:numId="8" w16cid:durableId="1598783071">
-    <w:abstractNumId w:val="11"/>
-  </w:num>
-  <w:num w:numId="9" w16cid:durableId="1825926394">
-    <w:abstractNumId w:val="12"/>
-  </w:num>
-  <w:num w:numId="10" w16cid:durableId="1521700032">
-    <w:abstractNumId w:val="6"/>
-  </w:num>
-  <w:num w:numId="11" w16cid:durableId="1339969525">
-    <w:abstractNumId w:val="7"/>
-  </w:num>
-  <w:num w:numId="12" w16cid:durableId="534124069">
-    <w:abstractNumId w:val="24"/>
-  </w:num>
-  <w:num w:numId="13" w16cid:durableId="635647341">
-    <w:abstractNumId w:val="9"/>
-  </w:num>
-  <w:num w:numId="14" w16cid:durableId="632834326">
-    <w:abstractNumId w:val="20"/>
-  </w:num>
   <w:num w:numId="15" w16cid:durableId="677318688">
-    <w:abstractNumId w:val="8"/>
+    <w:abstractNumId w:val="10"/>
   </w:num>
   <w:num w:numId="16" w16cid:durableId="109664322">
-    <w:abstractNumId w:val="14"/>
+    <w:abstractNumId w:val="16"/>
   </w:num>
   <w:num w:numId="17" w16cid:durableId="1744838441">
+    <w:abstractNumId w:val="21"/>
+  </w:num>
+  <w:num w:numId="18" w16cid:durableId="850409808">
     <w:abstractNumId w:val="19"/>
   </w:num>
-  <w:num w:numId="18" w16cid:durableId="850409808">
-    <w:abstractNumId w:val="17"/>
-  </w:num>
   <w:num w:numId="19" w16cid:durableId="977219952">
-    <w:abstractNumId w:val="18"/>
+    <w:abstractNumId w:val="20"/>
   </w:num>
   <w:num w:numId="20" w16cid:durableId="2142720453">
     <w:abstractNumId w:val="0"/>
   </w:num>
   <w:num w:numId="21" w16cid:durableId="244653084">
-    <w:abstractNumId w:val="15"/>
+    <w:abstractNumId w:val="17"/>
   </w:num>
   <w:num w:numId="22" w16cid:durableId="555552294">
-    <w:abstractNumId w:val="16"/>
+    <w:abstractNumId w:val="18"/>
   </w:num>
   <w:num w:numId="23" w16cid:durableId="301080497">
-    <w:abstractNumId w:val="21"/>
+    <w:abstractNumId w:val="24"/>
   </w:num>
   <w:num w:numId="24" w16cid:durableId="592861106">
     <w:abstractNumId w:val="1"/>
   </w:num>
   <w:num w:numId="25" w16cid:durableId="118882420">
     <w:abstractNumId w:val="5"/>
+  </w:num>
+  <w:num w:numId="26" w16cid:durableId="801849575">
+    <w:abstractNumId w:val="6"/>
+  </w:num>
+  <w:num w:numId="27" w16cid:durableId="2057316303">
+    <w:abstractNumId w:val="27"/>
+  </w:num>
+  <w:num w:numId="28" w16cid:durableId="1111627323">
+    <w:abstractNumId w:val="7"/>
+  </w:num>
+  <w:num w:numId="29" w16cid:durableId="1155414030">
+    <w:abstractNumId w:val="22"/>
   </w:num>
 </w:numbering>
 </file>
@@ -9837,7 +10862,6 @@
   <w:style w:type="character" w:default="1" w:styleId="DefaultParagraphFont">
     <w:name w:val="Default Paragraph Font"/>
     <w:uiPriority w:val="1"/>
-    <w:semiHidden/>
     <w:unhideWhenUsed/>
   </w:style>
   <w:style w:type="table" w:default="1" w:styleId="TableNormal">

</xml_diff>